<commit_message>
Third independent reproduction; outputs from the corresponding author's machine
</commit_message>
<xml_diff>
--- a/docs/03-verification-summary.docx
+++ b/docs/03-verification-summary.docx
@@ -45,7 +45,7 @@
           <w:sz w:val="22"/>
           <w:szCs w:val="22"/>
         </w:rPr>
-        <w:t xml:space="preserve">Every finding below was produced twice, independently: once by the auditor who identified the problem and once by a second person working from the public repository without access to the first set of scripts. Where the two reproductions differ, the difference is stated. The scripts are available and can be deposited as supplementary material.</w:t>
+        <w:t xml:space="preserve">Every finding below was produced three times, independently: by the auditor who identified the problem, by a second person working from the public repository without access to the first set of scripts, and by the corresponding author on a third machine. Where the reproductions differ, the difference is stated. The scripts are available and can be deposited as supplementary material.</w:t>
       </w:r>
     </w:p>
     <w:p>
@@ -2511,7 +2511,7 @@
           <w:sz w:val="22"/>
           <w:szCs w:val="22"/>
         </w:rPr>
-        <w:t xml:space="preserve">The deterministic quantities — the column identity, every PLS result, H*, the parameter counts, and the untrained gate values — agree exactly between the two reproductions.</w:t>
+        <w:t xml:space="preserve">The deterministic quantities — the column identity, every PLS result, H*, the parameter counts, and the untrained gate values — agree to every reported digit across all three reproductions, on three machines with different library versions. So do the trained gate measurements: the Tecator gate–prior correlation after training falls in 0.332–0.340 in all three, and the largest logit displacement in 1.5–1.9 against an initial gap of 11.47.</w:t>
       </w:r>
     </w:p>
     <w:p>
@@ -2525,7 +2525,7 @@
           <w:sz w:val="22"/>
           <w:szCs w:val="22"/>
         </w:rPr>
-        <w:t xml:space="preserve">The network arms agree once each arm’s own recipe is used. The published pipeline uses different hyperparameters for different arms: the compact model trains with a KL weight of 10⁻³, weight decay 10⁻⁴ and patience 30; the heavy CNN with a KL weight of 10⁻⁴, no weight decay and patience 20; and the randomly initialized arm runs all 200 epochs without early stopping. Applying one recipe to all arms changes the heavy-CNN median by several tenths of an R² unit. With the recipes matched, the two reproductions agree to within 0.02 in median R² on every arm, which is small against the replicate spread of the arms themselves — the single-test ANOVA arm alone ranges from 0.82 to 0.95.</w:t>
+        <w:t xml:space="preserve">The network arms do not. The published pipeline uses different hyperparameters for different arms — the compact model trains with a KL weight of 10⁻³, weight decay 10⁻⁴ and patience 30; the heavy CNN with a KL weight of 10⁻⁴, no weight decay and patience 20; the randomly initialized arm runs all 200 epochs without early stopping — and applying one recipe to all of them shifts the heavy-CNN median by several tenths of an R² unit. With the recipes matched, the three reproductions still give medians that differ by up to 0.03 on the same arm: the single-test ANOVA arm on the published target gives 0.905, 0.922 and 0.932. The difference is attributable to library versions, which affect layer initialization and the consumption of the random number stream, and it is small against the replicate spread within any one run — that same arm ranges from 0.82 to 0.95.</w:t>
       </w:r>
     </w:p>
     <w:p>
@@ -2539,7 +2539,7 @@
           <w:sz w:val="22"/>
           <w:szCs w:val="22"/>
         </w:rPr>
-        <w:t xml:space="preserve">The residual difference is attributable to library versions, which affect layer initialization and the consumption of the random number stream. It is reported here rather than reconciled, because it is itself part of the finding: single runs of this pipeline are not reproducible, which is why the corrected table reports medians and ranges.</w:t>
+        <w:t xml:space="preserve">This is reported rather than reconciled, because it is itself part of the finding: single runs of this pipeline are not reproducible, which is why the corrected table reports medians and ranges rather than point values, and why the performance gap is stated as a range.</w:t>
       </w:r>
     </w:p>
     <w:p>

</xml_diff>

<commit_message>
Remove accidentally nested copy of the repository
</commit_message>
<xml_diff>
--- a/docs/03-verification-summary.docx
+++ b/docs/03-verification-summary.docx
@@ -45,7 +45,25 @@
           <w:sz w:val="22"/>
           <w:szCs w:val="22"/>
         </w:rPr>
-        <w:t xml:space="preserve">Every finding below was produced three times, independently: by the auditor who identified the problem, by a second person working from the public repository without access to the first set of scripts, and by the corresponding author on a third machine. Where the reproductions differ, the difference is stated. The scripts are available and can be deposited as supplementary material.</w:t>
+        <w:t xml:space="preserve">Every finding below was produced three times, independently: by the auditor who identified the problem, by a second person working from the public repository without access to the first set of scripts, and by the corresponding author on a third machine. Where the reproductions differ, the difference is stated. The scripts, their captured output and this summary are in a repository at https://github.com/clarimar/pgsg</w:t>
+      </w:r>
+      <w:r>
+        <w:rPr>
+          <w:rFonts w:ascii="Calibri" w:cs="Calibri" w:eastAsia="Calibri" w:hAnsi="Calibri"/>
+          <w:i/>
+          <w:iCs/>
+          <w:sz w:val="22"/>
+          <w:szCs w:val="22"/>
+        </w:rPr>
+        <w:t xml:space="preserve">0</w:t>
+      </w:r>
+      <w:r>
+        <w:rPr>
+          <w:rFonts w:ascii="Calibri" w:cs="Calibri" w:eastAsia="Calibri" w:hAnsi="Calibri"/>
+          <w:sz w:val="22"/>
+          <w:szCs w:val="22"/>
+        </w:rPr>
+        <w:t xml:space="preserve">corrigendum, which will be made public on publication of the corrigendum and can be deposited as supplementary material.</w:t>
       </w:r>
     </w:p>
     <w:p>

</xml_diff>